<commit_message>
Add all local files
</commit_message>
<xml_diff>
--- a/year_1/117/resources/Questions de repetition.docx
+++ b/year_1/117/resources/Questions de repetition.docx
@@ -4,10 +4,7 @@
   <w:body>
     <w:p>
       <w:r>
-        <w:t xml:space="preserve">Questions de </w:t>
-      </w:r>
-      <w:r>
-        <w:t>repetition?</w:t>
+        <w:t>Questions de repetition?</w:t>
       </w:r>
     </w:p>
     <w:p>
@@ -49,56 +46,56 @@
       <w:proofErr w:type="spellStart"/>
       <w:r>
         <w:rPr>
-          <w:color w:val="00B0F0"/>
+          <w:color w:val="0070C0"/>
         </w:rPr>
         <w:t>Règle</w:t>
       </w:r>
       <w:proofErr w:type="spellEnd"/>
       <w:r>
         <w:rPr>
-          <w:color w:val="00B0F0"/>
+          <w:color w:val="0070C0"/>
         </w:rPr>
         <w:t xml:space="preserve">/ </w:t>
       </w:r>
       <w:proofErr w:type="spellStart"/>
       <w:r>
         <w:rPr>
-          <w:color w:val="00B0F0"/>
+          <w:color w:val="0070C0"/>
         </w:rPr>
         <w:t>norme</w:t>
       </w:r>
       <w:proofErr w:type="spellEnd"/>
       <w:r>
         <w:rPr>
-          <w:color w:val="00B0F0"/>
+          <w:color w:val="0070C0"/>
         </w:rPr>
         <w:t xml:space="preserve"> de language </w:t>
       </w:r>
       <w:proofErr w:type="spellStart"/>
       <w:r>
         <w:rPr>
-          <w:color w:val="00B0F0"/>
+          <w:color w:val="0070C0"/>
         </w:rPr>
         <w:t>permettant</w:t>
       </w:r>
       <w:proofErr w:type="spellEnd"/>
       <w:r>
         <w:rPr>
-          <w:color w:val="00B0F0"/>
+          <w:color w:val="0070C0"/>
         </w:rPr>
         <w:t xml:space="preserve"> de transporter/ </w:t>
       </w:r>
       <w:proofErr w:type="spellStart"/>
       <w:r>
         <w:rPr>
-          <w:color w:val="00B0F0"/>
+          <w:color w:val="0070C0"/>
         </w:rPr>
         <w:t>d’échanger</w:t>
       </w:r>
       <w:proofErr w:type="spellEnd"/>
       <w:r>
         <w:rPr>
-          <w:color w:val="00B0F0"/>
+          <w:color w:val="0070C0"/>
         </w:rPr>
         <w:t xml:space="preserve"> des données</w:t>
       </w:r>
@@ -140,138 +137,138 @@
     <w:p>
       <w:pPr>
         <w:rPr>
-          <w:color w:val="00B0F0"/>
+          <w:color w:val="0070C0"/>
         </w:rPr>
       </w:pPr>
       <w:proofErr w:type="spellStart"/>
       <w:r>
         <w:rPr>
-          <w:color w:val="00B0F0"/>
+          <w:color w:val="0070C0"/>
         </w:rPr>
         <w:t>L’entête</w:t>
       </w:r>
       <w:proofErr w:type="spellEnd"/>
       <w:r>
         <w:rPr>
-          <w:color w:val="00B0F0"/>
+          <w:color w:val="0070C0"/>
         </w:rPr>
         <w:t xml:space="preserve"> </w:t>
       </w:r>
       <w:proofErr w:type="spellStart"/>
       <w:r>
         <w:rPr>
-          <w:color w:val="00B0F0"/>
+          <w:color w:val="0070C0"/>
         </w:rPr>
         <w:t>est</w:t>
       </w:r>
       <w:proofErr w:type="spellEnd"/>
       <w:r>
         <w:rPr>
-          <w:color w:val="00B0F0"/>
+          <w:color w:val="0070C0"/>
         </w:rPr>
         <w:t xml:space="preserve"> la </w:t>
       </w:r>
       <w:proofErr w:type="spellStart"/>
       <w:r>
         <w:rPr>
-          <w:color w:val="00B0F0"/>
+          <w:color w:val="0070C0"/>
         </w:rPr>
         <w:t>partie</w:t>
       </w:r>
       <w:proofErr w:type="spellEnd"/>
       <w:r>
         <w:rPr>
-          <w:color w:val="00B0F0"/>
+          <w:color w:val="0070C0"/>
         </w:rPr>
         <w:t xml:space="preserve"> du </w:t>
       </w:r>
       <w:proofErr w:type="spellStart"/>
       <w:r>
         <w:rPr>
-          <w:color w:val="00B0F0"/>
+          <w:color w:val="0070C0"/>
         </w:rPr>
         <w:t>paquet</w:t>
       </w:r>
       <w:proofErr w:type="spellEnd"/>
       <w:r>
         <w:rPr>
-          <w:color w:val="00B0F0"/>
+          <w:color w:val="0070C0"/>
         </w:rPr>
         <w:t xml:space="preserve"> qui </w:t>
       </w:r>
       <w:proofErr w:type="spellStart"/>
       <w:r>
         <w:rPr>
-          <w:color w:val="00B0F0"/>
+          <w:color w:val="0070C0"/>
         </w:rPr>
         <w:t>permet</w:t>
       </w:r>
       <w:proofErr w:type="spellEnd"/>
       <w:r>
         <w:rPr>
-          <w:color w:val="00B0F0"/>
+          <w:color w:val="0070C0"/>
         </w:rPr>
         <w:t xml:space="preserve"> de savoir de </w:t>
       </w:r>
       <w:proofErr w:type="spellStart"/>
       <w:r>
         <w:rPr>
-          <w:color w:val="00B0F0"/>
+          <w:color w:val="0070C0"/>
         </w:rPr>
         <w:t>ou</w:t>
       </w:r>
       <w:proofErr w:type="spellEnd"/>
       <w:r>
         <w:rPr>
-          <w:color w:val="00B0F0"/>
+          <w:color w:val="0070C0"/>
         </w:rPr>
         <w:t xml:space="preserve"> à </w:t>
       </w:r>
       <w:proofErr w:type="spellStart"/>
       <w:r>
         <w:rPr>
-          <w:color w:val="00B0F0"/>
+          <w:color w:val="0070C0"/>
         </w:rPr>
         <w:t>ou</w:t>
       </w:r>
       <w:proofErr w:type="spellEnd"/>
       <w:r>
         <w:rPr>
-          <w:color w:val="00B0F0"/>
+          <w:color w:val="0070C0"/>
         </w:rPr>
         <w:t xml:space="preserve"> </w:t>
       </w:r>
       <w:proofErr w:type="spellStart"/>
       <w:r>
         <w:rPr>
-          <w:color w:val="00B0F0"/>
+          <w:color w:val="0070C0"/>
         </w:rPr>
         <w:t>va</w:t>
       </w:r>
       <w:proofErr w:type="spellEnd"/>
       <w:r>
         <w:rPr>
-          <w:color w:val="00B0F0"/>
+          <w:color w:val="0070C0"/>
         </w:rPr>
         <w:t xml:space="preserve"> le </w:t>
       </w:r>
       <w:proofErr w:type="spellStart"/>
       <w:r>
         <w:rPr>
-          <w:color w:val="00B0F0"/>
+          <w:color w:val="0070C0"/>
         </w:rPr>
         <w:t>paquets</w:t>
       </w:r>
       <w:proofErr w:type="spellEnd"/>
       <w:r>
         <w:rPr>
-          <w:color w:val="00B0F0"/>
+          <w:color w:val="0070C0"/>
         </w:rPr>
         <w:t xml:space="preserve">. </w:t>
       </w:r>
       <w:r>
         <w:rPr>
-          <w:color w:val="00B0F0"/>
+          <w:color w:val="0070C0"/>
         </w:rPr>
         <w:br/>
         <w:t xml:space="preserve">Les champs de </w:t>
@@ -279,232 +276,897 @@
       <w:proofErr w:type="spellStart"/>
       <w:r>
         <w:rPr>
+          <w:color w:val="0070C0"/>
+        </w:rPr>
+        <w:t>l’entête</w:t>
+      </w:r>
+      <w:proofErr w:type="spellEnd"/>
+      <w:r>
+        <w:rPr>
+          <w:color w:val="0070C0"/>
+        </w:rPr>
+        <w:t xml:space="preserve"> </w:t>
+      </w:r>
+      <w:proofErr w:type="spellStart"/>
+      <w:r>
+        <w:rPr>
+          <w:color w:val="0070C0"/>
+        </w:rPr>
+        <w:t>sont</w:t>
+      </w:r>
+      <w:proofErr w:type="spellEnd"/>
+      <w:r>
+        <w:rPr>
+          <w:color w:val="0070C0"/>
+        </w:rPr>
+        <w:t xml:space="preserve"> le </w:t>
+      </w:r>
+      <w:proofErr w:type="spellStart"/>
+      <w:r>
+        <w:rPr>
+          <w:color w:val="0070C0"/>
+        </w:rPr>
+        <w:t>recepteur</w:t>
+      </w:r>
+      <w:proofErr w:type="spellEnd"/>
+      <w:r>
+        <w:rPr>
+          <w:color w:val="0070C0"/>
+        </w:rPr>
+        <w:t xml:space="preserve"> et </w:t>
+      </w:r>
+      <w:proofErr w:type="spellStart"/>
+      <w:r>
+        <w:rPr>
+          <w:color w:val="0070C0"/>
+        </w:rPr>
+        <w:t>l’éxpéditeur</w:t>
+      </w:r>
+      <w:proofErr w:type="spellEnd"/>
+      <w:r>
+        <w:rPr>
+          <w:color w:val="0070C0"/>
+        </w:rPr>
+        <w:t xml:space="preserve"> du </w:t>
+      </w:r>
+      <w:proofErr w:type="spellStart"/>
+      <w:r>
+        <w:rPr>
+          <w:color w:val="0070C0"/>
+        </w:rPr>
+        <w:t>paquet</w:t>
+      </w:r>
+      <w:proofErr w:type="spellEnd"/>
+      <w:r>
+        <w:rPr>
+          <w:color w:val="0070C0"/>
+        </w:rPr>
+        <w:t xml:space="preserve"> </w:t>
+      </w:r>
+    </w:p>
+    <w:p/>
+    <w:p>
+      <w:r>
+        <w:t xml:space="preserve">3) </w:t>
+      </w:r>
+      <w:proofErr w:type="spellStart"/>
+      <w:r>
+        <w:t>Trouver</w:t>
+      </w:r>
+      <w:proofErr w:type="spellEnd"/>
+      <w:r>
+        <w:t xml:space="preserve"> la signification du champ TTL (Time To </w:t>
+      </w:r>
+    </w:p>
+    <w:p>
+      <w:r>
+        <w:t xml:space="preserve">Live) de </w:t>
+      </w:r>
+      <w:proofErr w:type="spellStart"/>
+      <w:r>
+        <w:t>l’en</w:t>
+      </w:r>
+      <w:proofErr w:type="spellEnd"/>
+      <w:r>
+        <w:t xml:space="preserve">-tête d’un </w:t>
+      </w:r>
+      <w:proofErr w:type="spellStart"/>
+      <w:r>
+        <w:t>paquet</w:t>
+      </w:r>
+      <w:proofErr w:type="spellEnd"/>
+      <w:r>
+        <w:t xml:space="preserve"> IP.</w:t>
+      </w:r>
+    </w:p>
+    <w:p>
+      <w:r>
+        <w:rPr>
+          <w:color w:val="0070C0"/>
+        </w:rPr>
+        <w:t xml:space="preserve">Durée de vie </w:t>
+      </w:r>
+      <w:proofErr w:type="spellStart"/>
+      <w:r>
+        <w:rPr>
+          <w:color w:val="0070C0"/>
+        </w:rPr>
+        <w:t>compté</w:t>
+      </w:r>
+      <w:proofErr w:type="spellEnd"/>
+      <w:r>
+        <w:rPr>
+          <w:color w:val="0070C0"/>
+        </w:rPr>
+        <w:t xml:space="preserve"> </w:t>
+      </w:r>
+      <w:proofErr w:type="spellStart"/>
+      <w:r>
+        <w:rPr>
+          <w:color w:val="0070C0"/>
+        </w:rPr>
+        <w:t>en</w:t>
+      </w:r>
+      <w:proofErr w:type="spellEnd"/>
+      <w:r>
+        <w:rPr>
+          <w:color w:val="0070C0"/>
+        </w:rPr>
+        <w:t xml:space="preserve"> hop -&gt; le </w:t>
+      </w:r>
+      <w:proofErr w:type="spellStart"/>
+      <w:r>
+        <w:rPr>
+          <w:color w:val="0070C0"/>
+        </w:rPr>
+        <w:t>nombre</w:t>
+      </w:r>
+      <w:proofErr w:type="spellEnd"/>
+      <w:r>
+        <w:rPr>
+          <w:color w:val="0070C0"/>
+        </w:rPr>
+        <w:t xml:space="preserve"> de </w:t>
+      </w:r>
+      <w:proofErr w:type="spellStart"/>
+      <w:r>
+        <w:rPr>
+          <w:color w:val="0070C0"/>
+        </w:rPr>
+        <w:t>routeur</w:t>
+      </w:r>
+      <w:proofErr w:type="spellEnd"/>
+      <w:r>
+        <w:rPr>
+          <w:color w:val="0070C0"/>
+        </w:rPr>
+        <w:t xml:space="preserve"> par </w:t>
+      </w:r>
+      <w:proofErr w:type="spellStart"/>
+      <w:r>
+        <w:rPr>
+          <w:color w:val="0070C0"/>
+        </w:rPr>
+        <w:t>lequel</w:t>
+      </w:r>
+      <w:proofErr w:type="spellEnd"/>
+      <w:r>
+        <w:rPr>
+          <w:color w:val="0070C0"/>
+        </w:rPr>
+        <w:t xml:space="preserve"> il </w:t>
+      </w:r>
+      <w:proofErr w:type="spellStart"/>
+      <w:r>
+        <w:rPr>
+          <w:color w:val="0070C0"/>
+        </w:rPr>
+        <w:t>passera</w:t>
+      </w:r>
+      <w:proofErr w:type="spellEnd"/>
+      <w:r>
+        <w:rPr>
+          <w:color w:val="0070C0"/>
+        </w:rPr>
+        <w:t xml:space="preserve"> </w:t>
+      </w:r>
+      <w:proofErr w:type="spellStart"/>
+      <w:r>
+        <w:rPr>
+          <w:color w:val="0070C0"/>
+        </w:rPr>
+        <w:t>avant</w:t>
+      </w:r>
+      <w:proofErr w:type="spellEnd"/>
+      <w:r>
+        <w:rPr>
+          <w:color w:val="0070C0"/>
+        </w:rPr>
+        <w:t xml:space="preserve"> d’être </w:t>
+      </w:r>
+      <w:proofErr w:type="spellStart"/>
+      <w:r>
+        <w:rPr>
+          <w:color w:val="0070C0"/>
+        </w:rPr>
+        <w:t>détruit</w:t>
+      </w:r>
+      <w:proofErr w:type="spellEnd"/>
+      <w:r>
+        <w:rPr>
+          <w:color w:val="0070C0"/>
+        </w:rPr>
+        <w:t>.</w:t>
+      </w:r>
+      <w:r>
+        <w:rPr>
           <w:color w:val="00B0F0"/>
         </w:rPr>
-        <w:t>l’entête</w:t>
-      </w:r>
-      <w:proofErr w:type="spellEnd"/>
+        <w:br/>
+      </w:r>
       <w:r>
         <w:rPr>
           <w:color w:val="00B0F0"/>
         </w:rPr>
+        <w:br/>
+      </w:r>
+      <w:r>
+        <w:t>4</w:t>
+      </w:r>
+      <w:r>
+        <w:t xml:space="preserve">) Nommer et </w:t>
+      </w:r>
+      <w:proofErr w:type="spellStart"/>
+      <w:r>
+        <w:t>expliquer</w:t>
+      </w:r>
+      <w:proofErr w:type="spellEnd"/>
+      <w:r>
+        <w:t xml:space="preserve"> les </w:t>
+      </w:r>
+      <w:proofErr w:type="spellStart"/>
+      <w:r>
+        <w:t>différents</w:t>
+      </w:r>
+      <w:proofErr w:type="spellEnd"/>
+      <w:r>
+        <w:t xml:space="preserve"> champs de </w:t>
+      </w:r>
+      <w:proofErr w:type="spellStart"/>
+      <w:r>
+        <w:t>l’en</w:t>
+      </w:r>
+      <w:proofErr w:type="spellEnd"/>
+      <w:r>
+        <w:t xml:space="preserve"> tête </w:t>
+      </w:r>
+      <w:proofErr w:type="spellStart"/>
+      <w:r>
+        <w:t>d’un</w:t>
+      </w:r>
+      <w:r>
+        <w:t>e</w:t>
+      </w:r>
+      <w:proofErr w:type="spellEnd"/>
+      <w:r>
         <w:t xml:space="preserve"> </w:t>
       </w:r>
       <w:proofErr w:type="spellStart"/>
       <w:r>
-        <w:rPr>
-          <w:color w:val="00B0F0"/>
-        </w:rPr>
+        <w:t>trame</w:t>
+      </w:r>
+      <w:proofErr w:type="spellEnd"/>
+      <w:r>
+        <w:t xml:space="preserve"> Ethernet</w:t>
+      </w:r>
+    </w:p>
+    <w:p>
+      <w:pPr>
+        <w:rPr>
+          <w:color w:val="0070C0"/>
+          <w:lang w:val="en-US"/>
+        </w:rPr>
+      </w:pPr>
+      <w:r>
+        <w:rPr>
+          <w:color w:val="0070C0"/>
+        </w:rPr>
+        <w:t xml:space="preserve">En-tête </w:t>
+      </w:r>
+      <w:proofErr w:type="spellStart"/>
+      <w:r>
+        <w:rPr>
+          <w:color w:val="0070C0"/>
+        </w:rPr>
+        <w:t>d’une</w:t>
+      </w:r>
+      <w:proofErr w:type="spellEnd"/>
+      <w:r>
+        <w:rPr>
+          <w:color w:val="0070C0"/>
+        </w:rPr>
+        <w:t xml:space="preserve"> </w:t>
+      </w:r>
+      <w:proofErr w:type="spellStart"/>
+      <w:r>
+        <w:rPr>
+          <w:color w:val="0070C0"/>
+        </w:rPr>
+        <w:t>trame</w:t>
+      </w:r>
+      <w:proofErr w:type="spellEnd"/>
+      <w:r>
+        <w:rPr>
+          <w:color w:val="0070C0"/>
+        </w:rPr>
+        <w:t xml:space="preserve"> ethernet</w:t>
+      </w:r>
+    </w:p>
+    <w:p>
+      <w:pPr>
+        <w:rPr>
+          <w:color w:val="0070C0"/>
+        </w:rPr>
+      </w:pPr>
+      <w:r>
+        <w:rPr>
+          <w:color w:val="0070C0"/>
+        </w:rPr>
+        <w:t xml:space="preserve">Premier champ: </w:t>
+      </w:r>
+      <w:proofErr w:type="spellStart"/>
+      <w:r>
+        <w:rPr>
+          <w:color w:val="0070C0"/>
+        </w:rPr>
+        <w:t>L’adresse</w:t>
+      </w:r>
+      <w:proofErr w:type="spellEnd"/>
+      <w:r>
+        <w:rPr>
+          <w:color w:val="0070C0"/>
+        </w:rPr>
+        <w:t xml:space="preserve"> MAC du </w:t>
+      </w:r>
+      <w:proofErr w:type="spellStart"/>
+      <w:r>
+        <w:rPr>
+          <w:color w:val="0070C0"/>
+        </w:rPr>
+        <w:t>destinataire</w:t>
+      </w:r>
+      <w:proofErr w:type="spellEnd"/>
+      <w:r>
+        <w:rPr>
+          <w:color w:val="0070C0"/>
+        </w:rPr>
+        <w:t xml:space="preserve"> du </w:t>
+      </w:r>
+      <w:proofErr w:type="spellStart"/>
+      <w:r>
+        <w:rPr>
+          <w:color w:val="0070C0"/>
+        </w:rPr>
+        <w:t>paquet</w:t>
+      </w:r>
+      <w:proofErr w:type="spellEnd"/>
+    </w:p>
+    <w:p>
+      <w:pPr>
+        <w:rPr>
+          <w:color w:val="0070C0"/>
+        </w:rPr>
+      </w:pPr>
+    </w:p>
+    <w:p>
+      <w:pPr>
+        <w:rPr>
+          <w:color w:val="0070C0"/>
+        </w:rPr>
+      </w:pPr>
+      <w:r>
+        <w:rPr>
+          <w:color w:val="0070C0"/>
+        </w:rPr>
+        <w:t xml:space="preserve">Deuxième champs </w:t>
+      </w:r>
+      <w:proofErr w:type="spellStart"/>
+      <w:r>
+        <w:rPr>
+          <w:color w:val="0070C0"/>
+        </w:rPr>
+        <w:t>L’adresse</w:t>
+      </w:r>
+      <w:proofErr w:type="spellEnd"/>
+      <w:r>
+        <w:rPr>
+          <w:color w:val="0070C0"/>
+        </w:rPr>
+        <w:t xml:space="preserve"> Mac de </w:t>
+      </w:r>
+      <w:proofErr w:type="spellStart"/>
+      <w:r>
+        <w:rPr>
+          <w:color w:val="0070C0"/>
+        </w:rPr>
+        <w:t>l’expéditeur</w:t>
+      </w:r>
+      <w:proofErr w:type="spellEnd"/>
+    </w:p>
+    <w:p>
+      <w:pPr>
+        <w:rPr>
+          <w:color w:val="0070C0"/>
+        </w:rPr>
+      </w:pPr>
+    </w:p>
+    <w:p>
+      <w:pPr>
+        <w:rPr>
+          <w:color w:val="0070C0"/>
+        </w:rPr>
+      </w:pPr>
+      <w:proofErr w:type="spellStart"/>
+      <w:r>
+        <w:rPr>
+          <w:color w:val="0070C0"/>
+        </w:rPr>
+        <w:t>Troisième</w:t>
+      </w:r>
+      <w:proofErr w:type="spellEnd"/>
+      <w:r>
+        <w:rPr>
+          <w:color w:val="0070C0"/>
+        </w:rPr>
+        <w:t xml:space="preserve"> champ: Le type </w:t>
+      </w:r>
+      <w:proofErr w:type="spellStart"/>
+      <w:r>
+        <w:rPr>
+          <w:color w:val="0070C0"/>
+        </w:rPr>
+        <w:t>d’Ethernet</w:t>
+      </w:r>
+      <w:proofErr w:type="spellEnd"/>
+    </w:p>
+    <w:p>
+      <w:pPr>
+        <w:rPr>
+          <w:color w:val="0070C0"/>
+        </w:rPr>
+      </w:pPr>
+    </w:p>
+    <w:p>
+      <w:r>
+        <w:t>4)</w:t>
+      </w:r>
+      <w:proofErr w:type="spellStart"/>
+      <w:r>
+        <w:t>Quelles</w:t>
+      </w:r>
+      <w:proofErr w:type="spellEnd"/>
+      <w:r>
+        <w:t xml:space="preserve"> addresses MAC </w:t>
+      </w:r>
+      <w:proofErr w:type="spellStart"/>
+      <w:r>
         <w:t>sont</w:t>
       </w:r>
       <w:proofErr w:type="spellEnd"/>
       <w:r>
-        <w:rPr>
-          <w:color w:val="00B0F0"/>
-        </w:rPr>
+        <w:t xml:space="preserve"> </w:t>
+      </w:r>
+      <w:proofErr w:type="spellStart"/>
+      <w:r>
+        <w:t>valables</w:t>
+      </w:r>
+      <w:proofErr w:type="spellEnd"/>
+      <w:r>
+        <w:t>?</w:t>
+      </w:r>
+    </w:p>
+    <w:p>
+      <w:r>
+        <w:t>- 10-45-7A-95-22</w:t>
+      </w:r>
+    </w:p>
+    <w:p>
+      <w:pPr>
+        <w:rPr>
+          <w:color w:val="00B050"/>
+        </w:rPr>
+      </w:pPr>
+      <w:r>
+        <w:rPr>
+          <w:color w:val="00B050"/>
+        </w:rPr>
+        <w:t xml:space="preserve">- </w:t>
+      </w:r>
+      <w:r>
+        <w:rPr>
+          <w:color w:val="00B050"/>
+        </w:rPr>
+        <w:t xml:space="preserve"> </w:t>
+      </w:r>
+      <w:proofErr w:type="gramStart"/>
+      <w:r>
+        <w:rPr>
+          <w:color w:val="00B050"/>
+        </w:rPr>
+        <w:t>95:B1:6F</w:t>
+      </w:r>
+      <w:proofErr w:type="gramEnd"/>
+      <w:r>
+        <w:rPr>
+          <w:color w:val="00B050"/>
+        </w:rPr>
+        <w:t>:98:27:10</w:t>
+      </w:r>
+    </w:p>
+    <w:p>
+      <w:r>
+        <w:t xml:space="preserve">- </w:t>
+      </w:r>
+      <w:r>
+        <w:t>1010-0110-0110-0101</w:t>
+      </w:r>
+      <w:r>
+        <w:cr/>
+      </w:r>
+      <w:r>
+        <w:t xml:space="preserve">- </w:t>
+      </w:r>
+      <w:r>
+        <w:t xml:space="preserve"> 19 f3 35 16 1a</w:t>
+      </w:r>
+    </w:p>
+    <w:p>
+      <w:pPr>
+        <w:rPr>
+          <w:color w:val="00B050"/>
+        </w:rPr>
+      </w:pPr>
+      <w:r>
+        <w:rPr>
+          <w:color w:val="00B050"/>
+        </w:rPr>
+        <w:t>-</w:t>
+      </w:r>
+      <w:r>
+        <w:rPr>
+          <w:color w:val="00B050"/>
+        </w:rPr>
+        <w:t xml:space="preserve"> 111100000010101100010101101001101100010111001010</w:t>
+      </w:r>
+    </w:p>
+    <w:p>
+      <w:r>
+        <w:br w:type="page"/>
+      </w:r>
+    </w:p>
+    <w:p/>
+    <w:p>
+      <w:r>
+        <w:t xml:space="preserve">3) Vous </w:t>
+      </w:r>
+      <w:proofErr w:type="spellStart"/>
+      <w:r>
+        <w:t>désirez</w:t>
+      </w:r>
+      <w:proofErr w:type="spellEnd"/>
+      <w:r>
+        <w:t xml:space="preserve"> utiliser un switch Cisco « Catalyst </w:t>
+      </w:r>
+    </w:p>
+    <w:p>
+      <w:r>
+        <w:t xml:space="preserve">C9200L-24P-4X » pour faire la liaison entre </w:t>
+      </w:r>
+      <w:proofErr w:type="spellStart"/>
+      <w:r>
+        <w:t>votre</w:t>
+      </w:r>
+      <w:proofErr w:type="spellEnd"/>
+      <w:r>
+        <w:t xml:space="preserve"> </w:t>
+      </w:r>
+    </w:p>
+    <w:p>
+      <w:proofErr w:type="spellStart"/>
+      <w:r>
+        <w:t>routeur</w:t>
+      </w:r>
+      <w:proofErr w:type="spellEnd"/>
+      <w:r>
+        <w:t xml:space="preserve"> Salt Fiber, </w:t>
+      </w:r>
+      <w:proofErr w:type="spellStart"/>
+      <w:r>
+        <w:t>votre</w:t>
+      </w:r>
+      <w:proofErr w:type="spellEnd"/>
+      <w:r>
+        <w:t xml:space="preserve"> NAS et </w:t>
+      </w:r>
+      <w:proofErr w:type="spellStart"/>
+      <w:r>
+        <w:t>vos</w:t>
+      </w:r>
+      <w:proofErr w:type="spellEnd"/>
+      <w:r>
+        <w:t xml:space="preserve"> PC. </w:t>
+      </w:r>
+    </w:p>
+    <w:p>
+      <w:proofErr w:type="spellStart"/>
+      <w:r>
+        <w:t>Quels</w:t>
+      </w:r>
+      <w:proofErr w:type="spellEnd"/>
+      <w:r>
+        <w:t xml:space="preserve"> types de ports Ethernet </w:t>
+      </w:r>
+      <w:proofErr w:type="spellStart"/>
+      <w:r>
+        <w:t>utilisez-vous</w:t>
+      </w:r>
+      <w:proofErr w:type="spellEnd"/>
+      <w:r>
+        <w:t xml:space="preserve"> pour </w:t>
+      </w:r>
+    </w:p>
+    <w:p>
+      <w:proofErr w:type="spellStart"/>
+      <w:r>
+        <w:t>relier</w:t>
+      </w:r>
+      <w:proofErr w:type="spellEnd"/>
+      <w:r>
         <w:t xml:space="preserve"> le </w:t>
       </w:r>
       <w:proofErr w:type="spellStart"/>
       <w:r>
-        <w:rPr>
-          <w:color w:val="00B0F0"/>
-        </w:rPr>
-        <w:t>recepteur</w:t>
-      </w:r>
-      <w:proofErr w:type="spellEnd"/>
-      <w:r>
-        <w:rPr>
-          <w:color w:val="00B0F0"/>
-        </w:rPr>
-        <w:t xml:space="preserve"> et </w:t>
-      </w:r>
-      <w:proofErr w:type="spellStart"/>
-      <w:r>
-        <w:rPr>
-          <w:color w:val="00B0F0"/>
-        </w:rPr>
-        <w:t>l’éxpéditeur</w:t>
-      </w:r>
-      <w:proofErr w:type="spellEnd"/>
-      <w:r>
-        <w:rPr>
-          <w:color w:val="00B0F0"/>
-        </w:rPr>
-        <w:t xml:space="preserve"> du </w:t>
-      </w:r>
-      <w:proofErr w:type="spellStart"/>
-      <w:r>
-        <w:rPr>
-          <w:color w:val="00B0F0"/>
-        </w:rPr>
-        <w:t>paquet</w:t>
-      </w:r>
-      <w:proofErr w:type="spellEnd"/>
-      <w:r>
-        <w:rPr>
-          <w:color w:val="00B0F0"/>
-        </w:rPr>
+        <w:t>routeur</w:t>
+      </w:r>
+      <w:proofErr w:type="spellEnd"/>
+      <w:r>
+        <w:t xml:space="preserve"> Salt et </w:t>
+      </w:r>
+      <w:proofErr w:type="spellStart"/>
+      <w:r>
+        <w:t>votre</w:t>
+      </w:r>
+      <w:proofErr w:type="spellEnd"/>
+      <w:r>
+        <w:t xml:space="preserve"> NAS? </w:t>
+      </w:r>
+    </w:p>
+    <w:p>
+      <w:proofErr w:type="spellStart"/>
+      <w:r>
+        <w:t>Aidez-vous</w:t>
+      </w:r>
+      <w:proofErr w:type="spellEnd"/>
+      <w:r>
+        <w:t xml:space="preserve"> des sites Cisco et Salt pour </w:t>
+      </w:r>
+      <w:proofErr w:type="spellStart"/>
+      <w:r>
+        <w:t>vos</w:t>
+      </w:r>
+      <w:proofErr w:type="spellEnd"/>
+      <w:r>
         <w:t xml:space="preserve"> </w:t>
       </w:r>
     </w:p>
-    <w:p/>
-    <w:p>
-      <w:r>
-        <w:t xml:space="preserve">3) </w:t>
-      </w:r>
-      <w:proofErr w:type="spellStart"/>
-      <w:r>
-        <w:t>Trouver</w:t>
-      </w:r>
-      <w:proofErr w:type="spellEnd"/>
-      <w:r>
-        <w:t xml:space="preserve"> la signification du champ TTL (Time To </w:t>
-      </w:r>
-    </w:p>
-    <w:p>
-      <w:r>
-        <w:t xml:space="preserve">Live) de </w:t>
-      </w:r>
-      <w:proofErr w:type="spellStart"/>
-      <w:r>
-        <w:t>l’en</w:t>
-      </w:r>
-      <w:proofErr w:type="spellEnd"/>
-      <w:r>
-        <w:t xml:space="preserve">-tête d’un </w:t>
-      </w:r>
-      <w:proofErr w:type="spellStart"/>
-      <w:r>
-        <w:t>paquet</w:t>
-      </w:r>
-      <w:proofErr w:type="spellEnd"/>
-      <w:r>
-        <w:t xml:space="preserve"> IP.</w:t>
-      </w:r>
-    </w:p>
     <w:p>
       <w:pPr>
         <w:rPr>
-          <w:color w:val="00B0F0"/>
+          <w:color w:val="0070C0"/>
         </w:rPr>
       </w:pPr>
-      <w:r>
-        <w:rPr>
-          <w:color w:val="00B0F0"/>
-        </w:rPr>
-        <w:t xml:space="preserve">Durée de vie </w:t>
-      </w:r>
-      <w:proofErr w:type="spellStart"/>
-      <w:r>
-        <w:rPr>
-          <w:color w:val="00B0F0"/>
-        </w:rPr>
-        <w:t>compté</w:t>
-      </w:r>
-      <w:proofErr w:type="spellEnd"/>
-      <w:r>
-        <w:rPr>
-          <w:color w:val="00B0F0"/>
-        </w:rPr>
-        <w:t xml:space="preserve"> </w:t>
-      </w:r>
-      <w:proofErr w:type="spellStart"/>
-      <w:r>
-        <w:rPr>
-          <w:color w:val="00B0F0"/>
-        </w:rPr>
-        <w:t>en</w:t>
-      </w:r>
-      <w:proofErr w:type="spellEnd"/>
-      <w:r>
-        <w:rPr>
-          <w:color w:val="00B0F0"/>
-        </w:rPr>
-        <w:t xml:space="preserve"> hop -&gt; le </w:t>
-      </w:r>
-      <w:proofErr w:type="spellStart"/>
-      <w:r>
-        <w:rPr>
-          <w:color w:val="00B0F0"/>
-        </w:rPr>
-        <w:t>nombre</w:t>
-      </w:r>
-      <w:proofErr w:type="spellEnd"/>
-      <w:r>
-        <w:rPr>
-          <w:color w:val="00B0F0"/>
-        </w:rPr>
-        <w:t xml:space="preserve"> de </w:t>
-      </w:r>
-      <w:proofErr w:type="spellStart"/>
-      <w:r>
-        <w:rPr>
-          <w:color w:val="00B0F0"/>
-        </w:rPr>
-        <w:t>routeur</w:t>
-      </w:r>
-      <w:proofErr w:type="spellEnd"/>
-      <w:r>
-        <w:rPr>
-          <w:color w:val="00B0F0"/>
-        </w:rPr>
-        <w:t xml:space="preserve"> par </w:t>
-      </w:r>
-      <w:proofErr w:type="spellStart"/>
-      <w:r>
-        <w:rPr>
-          <w:color w:val="00B0F0"/>
-        </w:rPr>
-        <w:t>lequel</w:t>
-      </w:r>
-      <w:proofErr w:type="spellEnd"/>
-      <w:r>
-        <w:rPr>
-          <w:color w:val="00B0F0"/>
-        </w:rPr>
-        <w:t xml:space="preserve"> il </w:t>
-      </w:r>
-      <w:proofErr w:type="spellStart"/>
-      <w:r>
-        <w:rPr>
-          <w:color w:val="00B0F0"/>
-        </w:rPr>
-        <w:t>passera</w:t>
-      </w:r>
-      <w:proofErr w:type="spellEnd"/>
-      <w:r>
-        <w:rPr>
-          <w:color w:val="00B0F0"/>
-        </w:rPr>
-        <w:t xml:space="preserve"> </w:t>
-      </w:r>
-      <w:proofErr w:type="spellStart"/>
-      <w:r>
-        <w:rPr>
-          <w:color w:val="00B0F0"/>
-        </w:rPr>
-        <w:t>avant</w:t>
-      </w:r>
-      <w:proofErr w:type="spellEnd"/>
-      <w:r>
-        <w:rPr>
-          <w:color w:val="00B0F0"/>
-        </w:rPr>
-        <w:t xml:space="preserve"> d’être </w:t>
-      </w:r>
-      <w:proofErr w:type="spellStart"/>
-      <w:r>
-        <w:rPr>
-          <w:color w:val="00B0F0"/>
-        </w:rPr>
-        <w:t>détruit</w:t>
-      </w:r>
-      <w:proofErr w:type="spellEnd"/>
-      <w:r>
-        <w:rPr>
-          <w:color w:val="00B0F0"/>
-        </w:rPr>
+      <w:proofErr w:type="spellStart"/>
+      <w:r>
+        <w:t>recherches</w:t>
+      </w:r>
+      <w:proofErr w:type="spellEnd"/>
+      <w:r>
         <w:t>.</w:t>
+      </w:r>
+      <w:r>
+        <w:br/>
+      </w:r>
+      <w:r>
+        <w:br/>
+      </w:r>
+      <w:r>
+        <w:rPr>
+          <w:color w:val="0070C0"/>
+        </w:rPr>
+        <w:t>C9200L-24P-4X</w:t>
+      </w:r>
+      <w:proofErr w:type="gramStart"/>
+      <w:r>
+        <w:rPr>
+          <w:color w:val="0070C0"/>
+        </w:rPr>
+        <w:t xml:space="preserve">=  </w:t>
+      </w:r>
+      <w:r>
+        <w:rPr>
+          <w:color w:val="0070C0"/>
+        </w:rPr>
+        <w:t>2</w:t>
+      </w:r>
+      <w:r>
+        <w:rPr>
+          <w:color w:val="0070C0"/>
+        </w:rPr>
+        <w:t>4</w:t>
+      </w:r>
+      <w:proofErr w:type="gramEnd"/>
+      <w:r>
+        <w:rPr>
+          <w:color w:val="0070C0"/>
+        </w:rPr>
+        <w:t xml:space="preserve"> port full </w:t>
+      </w:r>
+      <w:proofErr w:type="gramStart"/>
+      <w:r>
+        <w:rPr>
+          <w:color w:val="0070C0"/>
+        </w:rPr>
+        <w:t>POE(</w:t>
+      </w:r>
+      <w:proofErr w:type="gramEnd"/>
+      <w:r>
+        <w:rPr>
+          <w:color w:val="0070C0"/>
+        </w:rPr>
+        <w:t>alimentation over ethernet)</w:t>
+      </w:r>
+    </w:p>
+    <w:p>
+      <w:pPr>
+        <w:rPr>
+          <w:color w:val="0070C0"/>
+        </w:rPr>
+      </w:pPr>
+      <w:r>
+        <w:rPr>
+          <w:color w:val="0070C0"/>
+        </w:rPr>
+        <w:tab/>
+      </w:r>
+      <w:r>
+        <w:rPr>
+          <w:color w:val="0070C0"/>
+        </w:rPr>
+        <w:tab/>
+      </w:r>
+      <w:r>
+        <w:rPr>
+          <w:color w:val="0070C0"/>
+        </w:rPr>
+        <w:tab/>
+        <w:t xml:space="preserve">4 port 10 </w:t>
+      </w:r>
+      <w:proofErr w:type="spellStart"/>
+      <w:r>
+        <w:rPr>
+          <w:color w:val="0070C0"/>
+        </w:rPr>
+        <w:t>ou</w:t>
+      </w:r>
+      <w:proofErr w:type="spellEnd"/>
+      <w:r>
+        <w:rPr>
+          <w:color w:val="0070C0"/>
+        </w:rPr>
+        <w:t xml:space="preserve"> 1 Giga</w:t>
+      </w:r>
+    </w:p>
+    <w:p>
+      <w:pPr>
+        <w:rPr>
+          <w:color w:val="0070C0"/>
+        </w:rPr>
+      </w:pPr>
+    </w:p>
+    <w:p>
+      <w:pPr>
+        <w:rPr>
+          <w:color w:val="0070C0"/>
+        </w:rPr>
+      </w:pPr>
+    </w:p>
+    <w:p>
+      <w:pPr>
+        <w:rPr>
+          <w:color w:val="0070C0"/>
+        </w:rPr>
+      </w:pPr>
+    </w:p>
+    <w:p>
+      <w:pPr>
+        <w:rPr>
+          <w:color w:val="0070C0"/>
+        </w:rPr>
+      </w:pPr>
+      <w:r>
+        <w:rPr>
+          <w:color w:val="0070C0"/>
+        </w:rPr>
+        <w:br/>
+      </w:r>
+      <w:r>
+        <w:rPr>
+          <w:color w:val="0070C0"/>
+        </w:rPr>
+        <w:br/>
+      </w:r>
+      <w:r>
+        <w:rPr>
+          <w:color w:val="0070C0"/>
+        </w:rPr>
+        <w:t>Salt Fiber</w:t>
+      </w:r>
+      <w:r>
+        <w:rPr>
+          <w:color w:val="0070C0"/>
+        </w:rPr>
+        <w:t xml:space="preserve">= </w:t>
+      </w:r>
+      <w:r>
+        <w:rPr>
+          <w:color w:val="0070C0"/>
+        </w:rPr>
+        <w:tab/>
+        <w:t xml:space="preserve">4 </w:t>
+      </w:r>
+      <w:r>
+        <w:rPr>
+          <w:color w:val="0070C0"/>
+        </w:rPr>
+        <w:t>ports Ethernet (LAN) 1 Gbit/s</w:t>
+      </w:r>
+    </w:p>
+    <w:p>
+      <w:pPr>
+        <w:ind w:left="720" w:firstLine="720"/>
+        <w:rPr>
+          <w:color w:val="0070C0"/>
+        </w:rPr>
+      </w:pPr>
+      <w:r>
+        <w:rPr>
+          <w:color w:val="0070C0"/>
+        </w:rPr>
+        <w:t>1</w:t>
+      </w:r>
+      <w:r>
+        <w:rPr>
+          <w:color w:val="0070C0"/>
+        </w:rPr>
+        <w:t xml:space="preserve"> port Ethernet </w:t>
+      </w:r>
+      <w:r>
+        <w:rPr>
+          <w:color w:val="0070C0"/>
+        </w:rPr>
+        <w:t xml:space="preserve">FO </w:t>
+      </w:r>
+      <w:r>
+        <w:rPr>
+          <w:color w:val="0070C0"/>
+        </w:rPr>
+        <w:t>(LAN) 10 Gbit/s</w:t>
+      </w:r>
+      <w:r>
+        <w:rPr>
+          <w:color w:val="0070C0"/>
+        </w:rPr>
+        <w:br/>
       </w:r>
     </w:p>
     <w:sectPr>
@@ -1120,7 +1782,6 @@
   <w:style w:type="character" w:default="1" w:styleId="DefaultParagraphFont">
     <w:name w:val="Default Paragraph Font"/>
     <w:uiPriority w:val="1"/>
-    <w:semiHidden/>
     <w:unhideWhenUsed/>
   </w:style>
   <w:style w:type="table" w:default="1" w:styleId="TableNormal">

</xml_diff>